<commit_message>
Draft_011: remove excess blank paragraphs between body sections
Leftover empty paras from prior edits (including Table 6 removal)
were creating large gaps between sections. Trimmed to at most one
spacer between content blocks.
</commit_message>
<xml_diff>
--- a/thesis/003_ThesisProposal_Draft_011.docx
+++ b/thesis/003_ThesisProposal_Draft_011.docx
@@ -683,32 +683,6 @@
     </w:p>
     <w:p>
       <w:pPr>
-        <w:spacing w:after="0" w:before="0"/>
-      </w:pPr>
-      <w:r>
-        <w:rPr>
-          <w:rFonts w:ascii="Georgia" w:hAnsi="Georgia" w:eastAsia="Georgia"/>
-          <w:b w:val="0"/>
-          <w:i w:val="0"/>
-          <w:sz w:val="22"/>
-        </w:rPr>
-      </w:r>
-    </w:p>
-    <w:p>
-      <w:pPr>
-        <w:spacing w:after="0" w:before="0"/>
-      </w:pPr>
-      <w:r>
-        <w:rPr>
-          <w:rFonts w:ascii="Georgia" w:hAnsi="Georgia" w:eastAsia="Georgia"/>
-          <w:b w:val="0"/>
-          <w:i w:val="0"/>
-          <w:sz w:val="22"/>
-        </w:rPr>
-      </w:r>
-    </w:p>
-    <w:p>
-      <w:pPr>
         <w:keepNext/>
         <w:keepLines/>
         <w:spacing w:before="240" w:after="240" w:line="480" w:lineRule="auto"/>
@@ -966,38 +940,6 @@
           <w:sz w:val="22"/>
         </w:rPr>
         <w:t xml:space="preserve">Philippine and regional findings align with this picture. Ningrum, Puspita, and Mulyadi (2024), using the ICNALE learner corpus across ten ASEAN contexts including the Philippines, found a preference for boosters over hedges, with overuse of forms such as completely, really, and always. Escalona (2025) examined essays by AB-English and BS-Information Technology students at Bukidnon State University. Major-field differences were not statistically significant, though descriptive patterns showed IT students using slightly more hedges and English majors slightly more boosters. Lopez et al. (2025) analyzed 50 argumentative essays by English Language Studies majors at a northern Philippine state university and found developing-stage proficiency with epistemic modal verbs most frequent across levels. Villanueva (2014) documented hedging in Philippine newspaper editorials as a means of managing accountability in politically sensitive claims—different genre, same point that hedging is context-sensitive.</w:t>
-      </w:r>
-    </w:p>
-    <w:p>
-      <w:pPr>
-        <w:spacing w:line="480" w:lineRule="auto" w:before="0" w:after="0"/>
-        <w:ind w:firstLine="720"/>
-        <w:jc w:val="both"/>
-      </w:pPr>
-      <w:r>
-        <w:rPr>
-          <w:rFonts w:ascii="Georgia" w:hAnsi="Georgia" w:eastAsia="Georgia"/>
-          <w:b w:val="0"/>
-          <w:i w:val="0"/>
-          <w:sz w:val="22"/>
-        </w:rPr>
-        <w:t xml:space="preserve"/>
-      </w:r>
-    </w:p>
-    <w:p>
-      <w:pPr>
-        <w:spacing w:line="480" w:lineRule="auto" w:before="0" w:after="0"/>
-        <w:ind w:firstLine="720"/>
-        <w:jc w:val="both"/>
-      </w:pPr>
-      <w:r>
-        <w:rPr>
-          <w:rFonts w:ascii="Georgia" w:hAnsi="Georgia" w:eastAsia="Georgia"/>
-          <w:b w:val="0"/>
-          <w:i w:val="0"/>
-          <w:sz w:val="22"/>
-        </w:rPr>
-        <w:t xml:space="preserve"/>
       </w:r>
     </w:p>
     <w:p>
@@ -2021,45 +1963,6 @@
     </w:p>
     <w:p>
       <w:pPr>
-        <w:spacing w:after="0" w:before="0"/>
-      </w:pPr>
-      <w:r>
-        <w:rPr>
-          <w:rFonts w:ascii="Georgia" w:hAnsi="Georgia" w:eastAsia="Georgia"/>
-          <w:b w:val="0"/>
-          <w:i w:val="0"/>
-          <w:sz w:val="22"/>
-        </w:rPr>
-      </w:r>
-    </w:p>
-    <w:p>
-      <w:pPr>
-        <w:spacing w:after="0" w:before="0"/>
-      </w:pPr>
-      <w:r>
-        <w:rPr>
-          <w:rFonts w:ascii="Georgia" w:hAnsi="Georgia" w:eastAsia="Georgia"/>
-          <w:b w:val="0"/>
-          <w:i w:val="0"/>
-          <w:sz w:val="22"/>
-        </w:rPr>
-      </w:r>
-    </w:p>
-    <w:p>
-      <w:pPr>
-        <w:spacing w:after="0" w:before="0"/>
-      </w:pPr>
-      <w:r>
-        <w:rPr>
-          <w:rFonts w:ascii="Georgia" w:hAnsi="Georgia" w:eastAsia="Georgia"/>
-          <w:b w:val="0"/>
-          <w:i w:val="0"/>
-          <w:sz w:val="22"/>
-        </w:rPr>
-      </w:r>
-    </w:p>
-    <w:p>
-      <w:pPr>
         <w:keepNext/>
         <w:keepLines/>
         <w:spacing w:before="0" w:after="0" w:line="480" w:lineRule="auto"/>
@@ -2073,32 +1976,6 @@
           <w:sz w:val="28"/>
         </w:rPr>
         <w:t>METHODOLOGY</w:t>
-      </w:r>
-    </w:p>
-    <w:p>
-      <w:pPr>
-        <w:spacing w:after="0" w:before="0"/>
-      </w:pPr>
-      <w:r>
-        <w:rPr>
-          <w:rFonts w:ascii="Georgia" w:hAnsi="Georgia" w:eastAsia="Georgia"/>
-          <w:b w:val="0"/>
-          <w:i w:val="0"/>
-          <w:sz w:val="22"/>
-        </w:rPr>
-      </w:r>
-    </w:p>
-    <w:p>
-      <w:pPr>
-        <w:spacing w:after="0" w:before="0"/>
-      </w:pPr>
-      <w:r>
-        <w:rPr>
-          <w:rFonts w:ascii="Georgia" w:hAnsi="Georgia" w:eastAsia="Georgia"/>
-          <w:b w:val="0"/>
-          <w:i w:val="0"/>
-          <w:sz w:val="22"/>
-        </w:rPr>
       </w:r>
     </w:p>
     <w:p>
@@ -3251,45 +3128,6 @@
     </w:p>
     <w:p>
       <w:pPr>
-        <w:spacing w:after="0" w:before="0"/>
-      </w:pPr>
-      <w:r>
-        <w:rPr>
-          <w:rFonts w:ascii="Georgia" w:hAnsi="Georgia" w:eastAsia="Georgia"/>
-          <w:b w:val="0"/>
-          <w:i w:val="0"/>
-          <w:sz w:val="22"/>
-        </w:rPr>
-      </w:r>
-    </w:p>
-    <w:p>
-      <w:pPr>
-        <w:spacing w:after="0" w:before="0"/>
-      </w:pPr>
-      <w:r>
-        <w:rPr>
-          <w:rFonts w:ascii="Georgia" w:hAnsi="Georgia" w:eastAsia="Georgia"/>
-          <w:b w:val="0"/>
-          <w:i w:val="0"/>
-          <w:sz w:val="22"/>
-        </w:rPr>
-      </w:r>
-    </w:p>
-    <w:p>
-      <w:pPr>
-        <w:spacing w:after="0" w:before="0"/>
-      </w:pPr>
-      <w:r>
-        <w:rPr>
-          <w:rFonts w:ascii="Georgia" w:hAnsi="Georgia" w:eastAsia="Georgia"/>
-          <w:b w:val="0"/>
-          <w:i w:val="0"/>
-          <w:sz w:val="22"/>
-        </w:rPr>
-      </w:r>
-    </w:p>
-    <w:p>
-      <w:pPr>
         <w:keepNext/>
         <w:keepLines/>
         <w:spacing w:before="0" w:after="0" w:line="480" w:lineRule="auto"/>
@@ -3303,32 +3141,6 @@
           <w:sz w:val="28"/>
         </w:rPr>
         <w:t>RESULTS, ANALYSIS, AND DISCUSSION</w:t>
-      </w:r>
-    </w:p>
-    <w:p>
-      <w:pPr>
-        <w:spacing w:after="0" w:before="0"/>
-      </w:pPr>
-      <w:r>
-        <w:rPr>
-          <w:rFonts w:ascii="Georgia" w:hAnsi="Georgia" w:eastAsia="Georgia"/>
-          <w:b w:val="0"/>
-          <w:i w:val="0"/>
-          <w:sz w:val="22"/>
-        </w:rPr>
-      </w:r>
-    </w:p>
-    <w:p>
-      <w:pPr>
-        <w:spacing w:after="0" w:before="0"/>
-      </w:pPr>
-      <w:r>
-        <w:rPr>
-          <w:rFonts w:ascii="Georgia" w:hAnsi="Georgia" w:eastAsia="Georgia"/>
-          <w:b w:val="0"/>
-          <w:i w:val="0"/>
-          <w:sz w:val="22"/>
-        </w:rPr>
       </w:r>
     </w:p>
     <w:p>
@@ -5899,58 +5711,6 @@
     </w:p>
     <w:p>
       <w:pPr>
-        <w:sectPr>
-          <w:headerReference w:type="default" r:id="rId14"/>
-          <w:headerReference w:type="first" r:id="rId15"/>
-          <w:pgSz w:w="11906" w:h="16838"/>
-          <w:pgMar w:top="1440" w:right="1440" w:bottom="1440" w:left="2160" w:header="720" w:footer="720" w:gutter="0"/>
-          <w:cols w:space="720"/>
-          <w:titlePg/>
-          <w:docGrid w:linePitch="360"/>
-        </w:sectPr>
-      </w:pPr>
-    </w:p>
-    <w:p>
-      <w:pPr>
-        <w:spacing w:after="0" w:before="0"/>
-      </w:pPr>
-      <w:r>
-        <w:rPr>
-          <w:rFonts w:ascii="Georgia" w:hAnsi="Georgia" w:eastAsia="Georgia"/>
-          <w:b w:val="0"/>
-          <w:i w:val="0"/>
-          <w:sz w:val="22"/>
-        </w:rPr>
-      </w:r>
-    </w:p>
-    <w:p>
-      <w:pPr>
-        <w:spacing w:after="0" w:before="0"/>
-      </w:pPr>
-      <w:r>
-        <w:rPr>
-          <w:rFonts w:ascii="Georgia" w:hAnsi="Georgia" w:eastAsia="Georgia"/>
-          <w:b w:val="0"/>
-          <w:i w:val="0"/>
-          <w:sz w:val="22"/>
-        </w:rPr>
-      </w:r>
-    </w:p>
-    <w:p>
-      <w:pPr>
-        <w:spacing w:after="0" w:before="0"/>
-      </w:pPr>
-      <w:r>
-        <w:rPr>
-          <w:rFonts w:ascii="Georgia" w:hAnsi="Georgia" w:eastAsia="Georgia"/>
-          <w:b w:val="0"/>
-          <w:i w:val="0"/>
-          <w:sz w:val="22"/>
-        </w:rPr>
-      </w:r>
-    </w:p>
-    <w:p>
-      <w:pPr>
         <w:keepNext/>
         <w:keepLines/>
         <w:spacing w:before="0" w:after="0" w:line="480" w:lineRule="auto"/>
@@ -5981,32 +5741,6 @@
     </w:p>
     <w:p>
       <w:pPr>
-        <w:spacing w:after="0" w:before="0"/>
-      </w:pPr>
-      <w:r>
-        <w:rPr>
-          <w:rFonts w:ascii="Georgia" w:hAnsi="Georgia" w:eastAsia="Georgia"/>
-          <w:b w:val="0"/>
-          <w:i w:val="0"/>
-          <w:sz w:val="22"/>
-        </w:rPr>
-      </w:r>
-    </w:p>
-    <w:p>
-      <w:pPr>
-        <w:spacing w:after="0" w:before="0"/>
-      </w:pPr>
-      <w:r>
-        <w:rPr>
-          <w:rFonts w:ascii="Georgia" w:hAnsi="Georgia" w:eastAsia="Georgia"/>
-          <w:b w:val="0"/>
-          <w:i w:val="0"/>
-          <w:sz w:val="22"/>
-        </w:rPr>
-      </w:r>
-    </w:p>
-    <w:p>
-      <w:pPr>
         <w:spacing w:line="480" w:lineRule="auto" w:before="0" w:after="0"/>
         <w:ind w:firstLine="720"/>
         <w:jc w:val="both"/>
@@ -6088,48 +5822,6 @@
     </w:p>
     <w:p>
       <w:pPr>
-        <w:spacing w:line="480" w:lineRule="auto" w:before="0" w:after="0"/>
-        <w:ind w:firstLine="720"/>
-        <w:jc w:val="both"/>
-      </w:pPr>
-      <w:r>
-        <w:t xml:space="preserve"/>
-      </w:r>
-    </w:p>
-    <w:p>
-      <w:pPr>
-        <w:spacing w:line="480" w:lineRule="auto" w:before="0" w:after="0"/>
-        <w:ind w:firstLine="720"/>
-        <w:jc w:val="both"/>
-      </w:pPr>
-      <w:r>
-        <w:rPr>
-          <w:rFonts w:ascii="Georgia" w:hAnsi="Georgia" w:eastAsia="Georgia"/>
-          <w:b w:val="0"/>
-          <w:i w:val="0"/>
-          <w:sz w:val="22"/>
-        </w:rPr>
-        <w:t xml:space="preserve"/>
-      </w:r>
-    </w:p>
-    <w:p>
-      <w:pPr>
-        <w:spacing w:line="480" w:lineRule="auto" w:before="0" w:after="0"/>
-        <w:ind w:firstLine="720"/>
-        <w:jc w:val="both"/>
-      </w:pPr>
-      <w:r>
-        <w:rPr>
-          <w:rFonts w:ascii="Georgia" w:hAnsi="Georgia" w:eastAsia="Georgia"/>
-          <w:b w:val="0"/>
-          <w:i w:val="0"/>
-          <w:sz w:val="22"/>
-        </w:rPr>
-        <w:t xml:space="preserve"/>
-      </w:r>
-    </w:p>
-    <w:p>
-      <w:pPr>
         <w:keepNext/>
         <w:keepLines/>
         <w:spacing w:before="240" w:after="240" w:line="480" w:lineRule="auto"/>
@@ -6185,34 +5877,6 @@
         <w:rPr>
           <w:rFonts w:ascii="Georgia" w:hAnsi="Georgia" w:eastAsia="Georgia"/>
           <w:b/>
-          <w:i w:val="0"/>
-          <w:sz w:val="22"/>
-        </w:rPr>
-      </w:r>
-    </w:p>
-    <w:p>
-      <w:pPr>
-        <w:spacing w:after="120"/>
-      </w:pPr>
-      <w:r>
-        <w:rPr>
-          <w:rFonts w:ascii="Georgia" w:hAnsi="Georgia" w:eastAsia="Georgia"/>
-          <w:b w:val="0"/>
-          <w:i/>
-          <w:sz w:val="22"/>
-        </w:rPr>
-      </w:r>
-    </w:p>
-    <w:p>
-      <w:pPr>
-        <w:spacing w:line="480" w:lineRule="auto" w:before="0" w:after="0"/>
-        <w:ind w:firstLine="720"/>
-        <w:jc w:val="both"/>
-      </w:pPr>
-      <w:r>
-        <w:rPr>
-          <w:rFonts w:ascii="Georgia" w:hAnsi="Georgia" w:eastAsia="Georgia"/>
-          <w:b w:val="0"/>
           <w:i w:val="0"/>
           <w:sz w:val="22"/>
         </w:rPr>
@@ -6297,45 +5961,6 @@
     </w:p>
     <w:p>
       <w:pPr>
-        <w:spacing w:after="0" w:before="0"/>
-      </w:pPr>
-      <w:r>
-        <w:rPr>
-          <w:rFonts w:ascii="Georgia" w:hAnsi="Georgia" w:eastAsia="Georgia"/>
-          <w:b w:val="0"/>
-          <w:i w:val="0"/>
-          <w:sz w:val="22"/>
-        </w:rPr>
-      </w:r>
-    </w:p>
-    <w:p>
-      <w:pPr>
-        <w:spacing w:after="0" w:before="0"/>
-      </w:pPr>
-      <w:r>
-        <w:rPr>
-          <w:rFonts w:ascii="Georgia" w:hAnsi="Georgia" w:eastAsia="Georgia"/>
-          <w:b w:val="0"/>
-          <w:i w:val="0"/>
-          <w:sz w:val="22"/>
-        </w:rPr>
-      </w:r>
-    </w:p>
-    <w:p>
-      <w:pPr>
-        <w:spacing w:after="0" w:before="0"/>
-      </w:pPr>
-      <w:r>
-        <w:rPr>
-          <w:rFonts w:ascii="Georgia" w:hAnsi="Georgia" w:eastAsia="Georgia"/>
-          <w:b w:val="0"/>
-          <w:i w:val="0"/>
-          <w:sz w:val="22"/>
-        </w:rPr>
-      </w:r>
-    </w:p>
-    <w:p>
-      <w:pPr>
         <w:keepNext/>
         <w:keepLines/>
         <w:spacing w:before="0" w:after="0" w:line="480" w:lineRule="auto"/>
@@ -6349,32 +5974,6 @@
           <w:sz w:val="28"/>
         </w:rPr>
         <w:t>REFERENCES</w:t>
-      </w:r>
-    </w:p>
-    <w:p>
-      <w:pPr>
-        <w:spacing w:after="0" w:before="0"/>
-      </w:pPr>
-      <w:r>
-        <w:rPr>
-          <w:rFonts w:ascii="Georgia" w:hAnsi="Georgia" w:eastAsia="Georgia"/>
-          <w:b w:val="0"/>
-          <w:i w:val="0"/>
-          <w:sz w:val="22"/>
-        </w:rPr>
-      </w:r>
-    </w:p>
-    <w:p>
-      <w:pPr>
-        <w:spacing w:after="0" w:before="0"/>
-      </w:pPr>
-      <w:r>
-        <w:rPr>
-          <w:rFonts w:ascii="Georgia" w:hAnsi="Georgia" w:eastAsia="Georgia"/>
-          <w:b w:val="0"/>
-          <w:i w:val="0"/>
-          <w:sz w:val="22"/>
-        </w:rPr>
       </w:r>
     </w:p>
     <w:p>
@@ -7028,45 +6627,6 @@
           <w:docGrid w:linePitch="360"/>
         </w:sectPr>
       </w:pPr>
-    </w:p>
-    <w:p>
-      <w:pPr>
-        <w:spacing w:after="0" w:before="0"/>
-      </w:pPr>
-      <w:r>
-        <w:rPr>
-          <w:rFonts w:ascii="Georgia" w:hAnsi="Georgia" w:eastAsia="Georgia"/>
-          <w:b w:val="0"/>
-          <w:i w:val="0"/>
-          <w:sz w:val="22"/>
-        </w:rPr>
-      </w:r>
-    </w:p>
-    <w:p>
-      <w:pPr>
-        <w:spacing w:after="0" w:before="0"/>
-      </w:pPr>
-      <w:r>
-        <w:rPr>
-          <w:rFonts w:ascii="Georgia" w:hAnsi="Georgia" w:eastAsia="Georgia"/>
-          <w:b w:val="0"/>
-          <w:i w:val="0"/>
-          <w:sz w:val="22"/>
-        </w:rPr>
-      </w:r>
-    </w:p>
-    <w:p>
-      <w:pPr>
-        <w:spacing w:after="0" w:before="0"/>
-      </w:pPr>
-      <w:r>
-        <w:rPr>
-          <w:rFonts w:ascii="Georgia" w:hAnsi="Georgia" w:eastAsia="Georgia"/>
-          <w:b w:val="0"/>
-          <w:i w:val="0"/>
-          <w:sz w:val="22"/>
-        </w:rPr>
-      </w:r>
     </w:p>
     <w:p>
       <w:pPr>

</xml_diff>

<commit_message>
Draft_011: restore Thesis Companion section spacing
- 3 blank lines before major HEADINGS (Introduction, Methodology, etc.)
- Sub-headings right-aligned, bold, 12pt Georgia per companion Table 1
- Body remains double-spaced, justified, 11pt Georgia; margins unchanged
</commit_message>
<xml_diff>
--- a/thesis/003_ThesisProposal_Draft_011.docx
+++ b/thesis/003_ThesisProposal_Draft_011.docx
@@ -640,19 +640,6 @@
     </w:p>
     <w:p>
       <w:pPr>
-        <w:spacing w:after="0" w:before="0"/>
-      </w:pPr>
-      <w:r>
-        <w:rPr>
-          <w:rFonts w:ascii="Georgia" w:hAnsi="Georgia" w:eastAsia="Georgia"/>
-          <w:b w:val="0"/>
-          <w:i w:val="0"/>
-          <w:sz w:val="22"/>
-        </w:rPr>
-      </w:r>
-    </w:p>
-    <w:p>
-      <w:pPr>
         <w:keepNext/>
         <w:keepLines/>
         <w:spacing w:before="0" w:after="0" w:line="480" w:lineRule="auto"/>
@@ -686,7 +673,7 @@
         <w:keepNext/>
         <w:keepLines/>
         <w:spacing w:before="240" w:after="240" w:line="480" w:lineRule="auto"/>
-        <w:jc w:val="left"/>
+        <w:jc w:val="right"/>
       </w:pPr>
       <w:r>
         <w:rPr>
@@ -1060,7 +1047,7 @@
         <w:keepNext/>
         <w:keepLines/>
         <w:spacing w:before="240" w:after="240" w:line="480" w:lineRule="auto"/>
-        <w:jc w:val="left"/>
+        <w:jc w:val="right"/>
       </w:pPr>
       <w:r>
         <w:rPr>
@@ -1169,7 +1156,7 @@
         <w:keepNext/>
         <w:keepLines/>
         <w:spacing w:before="240" w:after="240" w:line="480" w:lineRule="auto"/>
-        <w:jc w:val="left"/>
+        <w:jc w:val="right"/>
       </w:pPr>
       <w:r>
         <w:rPr>
@@ -1320,7 +1307,7 @@
         <w:keepNext/>
         <w:keepLines/>
         <w:spacing w:before="240" w:after="240" w:line="480" w:lineRule="auto"/>
-        <w:jc w:val="left"/>
+        <w:jc w:val="right"/>
       </w:pPr>
       <w:r>
         <w:rPr>
@@ -1453,7 +1440,7 @@
         <w:keepNext/>
         <w:keepLines/>
         <w:spacing w:before="240" w:after="240" w:line="480" w:lineRule="auto"/>
-        <w:jc w:val="left"/>
+        <w:jc w:val="right"/>
       </w:pPr>
       <w:r>
         <w:rPr>
@@ -1570,7 +1557,7 @@
         <w:keepNext/>
         <w:keepLines/>
         <w:spacing w:before="240" w:after="240" w:line="480" w:lineRule="auto"/>
-        <w:jc w:val="left"/>
+        <w:jc w:val="right"/>
       </w:pPr>
       <w:r>
         <w:rPr>
@@ -1963,6 +1950,28 @@
     </w:p>
     <w:p>
       <w:pPr>
+        <w:spacing w:line="480" w:lineRule="auto" w:before="0" w:after="0"/>
+      </w:pPr>
+      <w:r>
+        <w:rPr>
+          <w:rFonts w:ascii="Georgia" w:hAnsi="Georgia" w:cs="Georgia"/>
+          <w:sz w:val="22"/>
+        </w:rPr>
+      </w:r>
+    </w:p>
+    <w:p>
+      <w:pPr>
+        <w:spacing w:line="480" w:lineRule="auto" w:before="0" w:after="0"/>
+      </w:pPr>
+      <w:r>
+        <w:rPr>
+          <w:rFonts w:ascii="Georgia" w:hAnsi="Georgia" w:cs="Georgia"/>
+          <w:sz w:val="22"/>
+        </w:rPr>
+      </w:r>
+    </w:p>
+    <w:p>
+      <w:pPr>
         <w:keepNext/>
         <w:keepLines/>
         <w:spacing w:before="0" w:after="0" w:line="480" w:lineRule="auto"/>
@@ -2012,7 +2021,7 @@
         <w:keepNext/>
         <w:keepLines/>
         <w:spacing w:before="240" w:after="240" w:line="480" w:lineRule="auto"/>
-        <w:jc w:val="left"/>
+        <w:jc w:val="right"/>
       </w:pPr>
       <w:r>
         <w:rPr>
@@ -2077,7 +2086,7 @@
         <w:keepNext/>
         <w:keepLines/>
         <w:spacing w:before="240" w:after="240" w:line="480" w:lineRule="auto"/>
-        <w:jc w:val="left"/>
+        <w:jc w:val="right"/>
       </w:pPr>
       <w:r>
         <w:rPr>
@@ -2110,7 +2119,7 @@
         <w:keepNext/>
         <w:keepLines/>
         <w:spacing w:before="240" w:after="240" w:line="480" w:lineRule="auto"/>
-        <w:jc w:val="left"/>
+        <w:jc w:val="right"/>
       </w:pPr>
       <w:r>
         <w:rPr>
@@ -2293,7 +2302,7 @@
         <w:keepNext/>
         <w:keepLines/>
         <w:spacing w:before="240" w:after="240" w:line="480" w:lineRule="auto"/>
-        <w:jc w:val="left"/>
+        <w:jc w:val="right"/>
       </w:pPr>
       <w:r>
         <w:rPr>
@@ -2326,7 +2335,7 @@
         <w:keepNext/>
         <w:keepLines/>
         <w:spacing w:before="240" w:after="240" w:line="480" w:lineRule="auto"/>
-        <w:jc w:val="left"/>
+        <w:jc w:val="right"/>
       </w:pPr>
       <w:r>
         <w:rPr>
@@ -3128,6 +3137,28 @@
     </w:p>
     <w:p>
       <w:pPr>
+        <w:spacing w:line="480" w:lineRule="auto" w:before="0" w:after="0"/>
+      </w:pPr>
+      <w:r>
+        <w:rPr>
+          <w:rFonts w:ascii="Georgia" w:hAnsi="Georgia" w:cs="Georgia"/>
+          <w:sz w:val="22"/>
+        </w:rPr>
+      </w:r>
+    </w:p>
+    <w:p>
+      <w:pPr>
+        <w:spacing w:line="480" w:lineRule="auto" w:before="0" w:after="0"/>
+      </w:pPr>
+      <w:r>
+        <w:rPr>
+          <w:rFonts w:ascii="Georgia" w:hAnsi="Georgia" w:cs="Georgia"/>
+          <w:sz w:val="22"/>
+        </w:rPr>
+      </w:r>
+    </w:p>
+    <w:p>
+      <w:pPr>
         <w:keepNext/>
         <w:keepLines/>
         <w:spacing w:before="0" w:after="0" w:line="480" w:lineRule="auto"/>
@@ -3177,7 +3208,7 @@
         <w:keepNext/>
         <w:keepLines/>
         <w:spacing w:before="240" w:after="240" w:line="480" w:lineRule="auto"/>
-        <w:jc w:val="left"/>
+        <w:jc w:val="right"/>
       </w:pPr>
       <w:r>
         <w:rPr>
@@ -4291,7 +4322,7 @@
         <w:keepNext/>
         <w:keepLines/>
         <w:spacing w:before="240" w:after="240" w:line="480" w:lineRule="auto"/>
-        <w:jc w:val="left"/>
+        <w:jc w:val="right"/>
       </w:pPr>
       <w:r>
         <w:rPr>
@@ -5171,7 +5202,7 @@
         <w:keepNext/>
         <w:keepLines/>
         <w:spacing w:before="240" w:after="240" w:line="480" w:lineRule="auto"/>
-        <w:jc w:val="left"/>
+        <w:jc w:val="right"/>
       </w:pPr>
       <w:r>
         <w:rPr>
@@ -5577,7 +5608,7 @@
         <w:keepNext/>
         <w:keepLines/>
         <w:spacing w:before="240" w:after="240" w:line="480" w:lineRule="auto"/>
-        <w:jc w:val="left"/>
+        <w:jc w:val="right"/>
       </w:pPr>
       <w:r>
         <w:rPr>
@@ -5707,6 +5738,28 @@
       </w:pPr>
       <w:r>
         <w:t xml:space="preserve"/>
+      </w:r>
+    </w:p>
+    <w:p>
+      <w:pPr>
+        <w:spacing w:line="480" w:lineRule="auto" w:before="0" w:after="0"/>
+      </w:pPr>
+      <w:r>
+        <w:rPr>
+          <w:rFonts w:ascii="Georgia" w:hAnsi="Georgia" w:cs="Georgia"/>
+          <w:sz w:val="22"/>
+        </w:rPr>
+      </w:r>
+    </w:p>
+    <w:p>
+      <w:pPr>
+        <w:spacing w:line="480" w:lineRule="auto" w:before="0" w:after="0"/>
+      </w:pPr>
+      <w:r>
+        <w:rPr>
+          <w:rFonts w:ascii="Georgia" w:hAnsi="Georgia" w:cs="Georgia"/>
+          <w:sz w:val="22"/>
+        </w:rPr>
       </w:r>
     </w:p>
     <w:p>
@@ -5760,7 +5813,7 @@
         <w:keepNext/>
         <w:keepLines/>
         <w:spacing w:before="240" w:after="240" w:line="480" w:lineRule="auto"/>
-        <w:jc w:val="left"/>
+        <w:jc w:val="right"/>
       </w:pPr>
       <w:r>
         <w:rPr>
@@ -5825,7 +5878,7 @@
         <w:keepNext/>
         <w:keepLines/>
         <w:spacing w:before="240" w:after="240" w:line="480" w:lineRule="auto"/>
-        <w:jc w:val="left"/>
+        <w:jc w:val="right"/>
       </w:pPr>
       <w:r>
         <w:rPr>
@@ -5961,6 +6014,28 @@
     </w:p>
     <w:p>
       <w:pPr>
+        <w:spacing w:line="480" w:lineRule="auto" w:before="0" w:after="0"/>
+      </w:pPr>
+      <w:r>
+        <w:rPr>
+          <w:rFonts w:ascii="Georgia" w:hAnsi="Georgia" w:cs="Georgia"/>
+          <w:sz w:val="22"/>
+        </w:rPr>
+      </w:r>
+    </w:p>
+    <w:p>
+      <w:pPr>
+        <w:spacing w:line="480" w:lineRule="auto" w:before="0" w:after="0"/>
+      </w:pPr>
+      <w:r>
+        <w:rPr>
+          <w:rFonts w:ascii="Georgia" w:hAnsi="Georgia" w:cs="Georgia"/>
+          <w:sz w:val="22"/>
+        </w:rPr>
+      </w:r>
+    </w:p>
+    <w:p>
+      <w:pPr>
         <w:keepNext/>
         <w:keepLines/>
         <w:spacing w:before="0" w:after="0" w:line="480" w:lineRule="auto"/>
@@ -6627,6 +6702,28 @@
           <w:docGrid w:linePitch="360"/>
         </w:sectPr>
       </w:pPr>
+    </w:p>
+    <w:p>
+      <w:pPr>
+        <w:spacing w:line="480" w:lineRule="auto" w:before="0" w:after="0"/>
+      </w:pPr>
+      <w:r>
+        <w:rPr>
+          <w:rFonts w:ascii="Georgia" w:hAnsi="Georgia" w:cs="Georgia"/>
+          <w:sz w:val="22"/>
+        </w:rPr>
+      </w:r>
+    </w:p>
+    <w:p>
+      <w:pPr>
+        <w:spacing w:line="480" w:lineRule="auto" w:before="0" w:after="0"/>
+      </w:pPr>
+      <w:r>
+        <w:rPr>
+          <w:rFonts w:ascii="Georgia" w:hAnsi="Georgia" w:cs="Georgia"/>
+          <w:sz w:val="22"/>
+        </w:rPr>
+      </w:r>
     </w:p>
     <w:p>
       <w:pPr>

</xml_diff>

<commit_message>
Draft_011: sub-headings left-aligned (keep 3-blank major spacing)
</commit_message>
<xml_diff>
--- a/thesis/003_ThesisProposal_Draft_011.docx
+++ b/thesis/003_ThesisProposal_Draft_011.docx
@@ -673,7 +673,7 @@
         <w:keepNext/>
         <w:keepLines/>
         <w:spacing w:before="240" w:after="240" w:line="480" w:lineRule="auto"/>
-        <w:jc w:val="right"/>
+        <w:jc w:val="left"/>
       </w:pPr>
       <w:r>
         <w:rPr>
@@ -1047,7 +1047,7 @@
         <w:keepNext/>
         <w:keepLines/>
         <w:spacing w:before="240" w:after="240" w:line="480" w:lineRule="auto"/>
-        <w:jc w:val="right"/>
+        <w:jc w:val="left"/>
       </w:pPr>
       <w:r>
         <w:rPr>
@@ -1156,7 +1156,7 @@
         <w:keepNext/>
         <w:keepLines/>
         <w:spacing w:before="240" w:after="240" w:line="480" w:lineRule="auto"/>
-        <w:jc w:val="right"/>
+        <w:jc w:val="left"/>
       </w:pPr>
       <w:r>
         <w:rPr>
@@ -1307,7 +1307,7 @@
         <w:keepNext/>
         <w:keepLines/>
         <w:spacing w:before="240" w:after="240" w:line="480" w:lineRule="auto"/>
-        <w:jc w:val="right"/>
+        <w:jc w:val="left"/>
       </w:pPr>
       <w:r>
         <w:rPr>
@@ -1440,7 +1440,7 @@
         <w:keepNext/>
         <w:keepLines/>
         <w:spacing w:before="240" w:after="240" w:line="480" w:lineRule="auto"/>
-        <w:jc w:val="right"/>
+        <w:jc w:val="left"/>
       </w:pPr>
       <w:r>
         <w:rPr>
@@ -1557,7 +1557,7 @@
         <w:keepNext/>
         <w:keepLines/>
         <w:spacing w:before="240" w:after="240" w:line="480" w:lineRule="auto"/>
-        <w:jc w:val="right"/>
+        <w:jc w:val="left"/>
       </w:pPr>
       <w:r>
         <w:rPr>
@@ -2021,7 +2021,7 @@
         <w:keepNext/>
         <w:keepLines/>
         <w:spacing w:before="240" w:after="240" w:line="480" w:lineRule="auto"/>
-        <w:jc w:val="right"/>
+        <w:jc w:val="left"/>
       </w:pPr>
       <w:r>
         <w:rPr>
@@ -2086,7 +2086,7 @@
         <w:keepNext/>
         <w:keepLines/>
         <w:spacing w:before="240" w:after="240" w:line="480" w:lineRule="auto"/>
-        <w:jc w:val="right"/>
+        <w:jc w:val="left"/>
       </w:pPr>
       <w:r>
         <w:rPr>
@@ -2119,7 +2119,7 @@
         <w:keepNext/>
         <w:keepLines/>
         <w:spacing w:before="240" w:after="240" w:line="480" w:lineRule="auto"/>
-        <w:jc w:val="right"/>
+        <w:jc w:val="left"/>
       </w:pPr>
       <w:r>
         <w:rPr>
@@ -2302,7 +2302,7 @@
         <w:keepNext/>
         <w:keepLines/>
         <w:spacing w:before="240" w:after="240" w:line="480" w:lineRule="auto"/>
-        <w:jc w:val="right"/>
+        <w:jc w:val="left"/>
       </w:pPr>
       <w:r>
         <w:rPr>
@@ -2335,7 +2335,7 @@
         <w:keepNext/>
         <w:keepLines/>
         <w:spacing w:before="240" w:after="240" w:line="480" w:lineRule="auto"/>
-        <w:jc w:val="right"/>
+        <w:jc w:val="left"/>
       </w:pPr>
       <w:r>
         <w:rPr>
@@ -3208,7 +3208,7 @@
         <w:keepNext/>
         <w:keepLines/>
         <w:spacing w:before="240" w:after="240" w:line="480" w:lineRule="auto"/>
-        <w:jc w:val="right"/>
+        <w:jc w:val="left"/>
       </w:pPr>
       <w:r>
         <w:rPr>
@@ -4322,7 +4322,7 @@
         <w:keepNext/>
         <w:keepLines/>
         <w:spacing w:before="240" w:after="240" w:line="480" w:lineRule="auto"/>
-        <w:jc w:val="right"/>
+        <w:jc w:val="left"/>
       </w:pPr>
       <w:r>
         <w:rPr>
@@ -5202,7 +5202,7 @@
         <w:keepNext/>
         <w:keepLines/>
         <w:spacing w:before="240" w:after="240" w:line="480" w:lineRule="auto"/>
-        <w:jc w:val="right"/>
+        <w:jc w:val="left"/>
       </w:pPr>
       <w:r>
         <w:rPr>
@@ -5608,7 +5608,7 @@
         <w:keepNext/>
         <w:keepLines/>
         <w:spacing w:before="240" w:after="240" w:line="480" w:lineRule="auto"/>
-        <w:jc w:val="right"/>
+        <w:jc w:val="left"/>
       </w:pPr>
       <w:r>
         <w:rPr>
@@ -5813,7 +5813,7 @@
         <w:keepNext/>
         <w:keepLines/>
         <w:spacing w:before="240" w:after="240" w:line="480" w:lineRule="auto"/>
-        <w:jc w:val="right"/>
+        <w:jc w:val="left"/>
       </w:pPr>
       <w:r>
         <w:rPr>
@@ -5878,7 +5878,7 @@
         <w:keepNext/>
         <w:keepLines/>
         <w:spacing w:before="240" w:after="240" w:line="480" w:lineRule="auto"/>
-        <w:jc w:val="right"/>
+        <w:jc w:val="left"/>
       </w:pPr>
       <w:r>
         <w:rPr>

</xml_diff>

<commit_message>
Draft_011: major sections start on new pages
Page break before Methodology, Results, Conclusions, References,
Appendices, Appendix B and C. Introduction follows title page
without an extra blank page; Appendix A continues under Appendices.
</commit_message>
<xml_diff>
--- a/thesis/003_ThesisProposal_Draft_011.docx
+++ b/thesis/003_ThesisProposal_Draft_011.docx
@@ -1972,6 +1972,7 @@
     </w:p>
     <w:p>
       <w:pPr>
+        <w:pageBreakBefore/>
         <w:keepNext/>
         <w:keepLines/>
         <w:spacing w:before="0" w:after="0" w:line="480" w:lineRule="auto"/>
@@ -3159,6 +3160,7 @@
     </w:p>
     <w:p>
       <w:pPr>
+        <w:pageBreakBefore/>
         <w:keepNext/>
         <w:keepLines/>
         <w:spacing w:before="0" w:after="0" w:line="480" w:lineRule="auto"/>
@@ -5764,6 +5766,7 @@
     </w:p>
     <w:p>
       <w:pPr>
+        <w:pageBreakBefore/>
         <w:keepNext/>
         <w:keepLines/>
         <w:spacing w:before="0" w:after="0" w:line="480" w:lineRule="auto"/>
@@ -6036,6 +6039,7 @@
     </w:p>
     <w:p>
       <w:pPr>
+        <w:pageBreakBefore/>
         <w:keepNext/>
         <w:keepLines/>
         <w:spacing w:before="0" w:after="0" w:line="480" w:lineRule="auto"/>
@@ -6727,6 +6731,7 @@
     </w:p>
     <w:p>
       <w:pPr>
+        <w:pageBreakBefore/>
         <w:keepNext/>
         <w:keepLines/>
         <w:spacing w:before="0" w:after="240" w:line="240" w:lineRule="auto"/>
@@ -12252,6 +12257,7 @@
     </w:tbl>
     <w:p>
       <w:pPr>
+        <w:pageBreakBefore/>
         <w:spacing w:before="360" w:after="200" w:line="240" w:lineRule="auto"/>
         <w:jc w:val="center"/>
       </w:pPr>
@@ -12856,6 +12862,7 @@
     </w:p>
     <w:p>
       <w:pPr>
+        <w:pageBreakBefore/>
         <w:spacing w:before="360" w:after="200" w:line="240" w:lineRule="auto"/>
         <w:jc w:val="center"/>
       </w:pPr>

</xml_diff>

<commit_message>
Draft_011: unbold Significance of the Study body paragraphs
</commit_message>
<xml_diff>
--- a/thesis/003_ThesisProposal_Draft_011.docx
+++ b/thesis/003_ThesisProposal_Draft_011.docx
@@ -1344,7 +1344,7 @@
       <w:r>
         <w:rPr>
           <w:rFonts w:ascii="Georgia" w:hAnsi="Georgia" w:eastAsia="Georgia"/>
-          <w:b/>
+          <w:b w:val="0"/>
           <w:i w:val="0"/>
           <w:sz w:val="22"/>
         </w:rPr>
@@ -1369,7 +1369,7 @@
       <w:r>
         <w:rPr>
           <w:rFonts w:ascii="Georgia" w:hAnsi="Georgia" w:eastAsia="Georgia"/>
-          <w:b/>
+          <w:b w:val="0"/>
           <w:i w:val="0"/>
           <w:sz w:val="22"/>
         </w:rPr>
@@ -1394,7 +1394,7 @@
       <w:r>
         <w:rPr>
           <w:rFonts w:ascii="Georgia" w:hAnsi="Georgia" w:eastAsia="Georgia"/>
-          <w:b/>
+          <w:b w:val="0"/>
           <w:i w:val="0"/>
           <w:sz w:val="22"/>
         </w:rPr>

</xml_diff>